<commit_message>
Update graduation date to Dec 2026, add standalone Macy's & EquiLedger simulators, and update CV
</commit_message>
<xml_diff>
--- a/AJ_AlJarallah_CV_Master.docx
+++ b/AJ_AlJarallah_CV_Master.docx
@@ -115,33 +115,9 @@
         <w:spacing w:after="0" w:before="160"/>
       </w:pPr>
       <w:r>
-        <w:rPr>
-          <w:rFonts w:ascii="Arial" w:cs="Arial" w:eastAsia="Arial" w:hAnsi="Arial"/>
-          <w:b/>
-          <w:bCs/>
-          <w:color w:val="111111"/>
-          <w:sz w:val="22"/>
-          <w:szCs w:val="22"/>
-        </w:rPr>
-        <w:t xml:space="preserve">Direct Avenue (Performance Media Agency, US)</w:t>
-      </w:r>
-      <w:r>
-        <w:rPr>
-          <w:rFonts w:ascii="Arial" w:cs="Arial" w:eastAsia="Arial" w:hAnsi="Arial"/>
-          <w:color w:val="555555"/>
-          <w:sz w:val="20"/>
-          <w:szCs w:val="20"/>
-        </w:rPr>
-        <w:t xml:space="preserve">   Remote / San Diego</w:t>
-      </w:r>
-      <w:r>
-        <w:rPr>
-          <w:rFonts w:ascii="Arial" w:cs="Arial" w:eastAsia="Arial" w:hAnsi="Arial"/>
-          <w:color w:val="555555"/>
-          <w:sz w:val="20"/>
-          <w:szCs w:val="20"/>
-        </w:rPr>
-        <w:t xml:space="preserve">	Mar 2026 – Jun 2026</w:t>
+        <w:t>Direct Avenue (Performance Media Agency, US)   Remote / San Diego</w:t>
+        <w:tab/>
+        <w:t>Mar 2026 – Dec 2026</w:t>
       </w:r>
     </w:p>
     <w:p>
@@ -1292,33 +1268,9 @@
         <w:spacing w:after="0" w:before="160"/>
       </w:pPr>
       <w:r>
-        <w:rPr>
-          <w:rFonts w:ascii="Arial" w:cs="Arial" w:eastAsia="Arial" w:hAnsi="Arial"/>
-          <w:b/>
-          <w:bCs/>
-          <w:color w:val="111111"/>
-          <w:sz w:val="22"/>
-          <w:szCs w:val="22"/>
-        </w:rPr>
-        <w:t xml:space="preserve">UC San Diego — Rady School of Management</w:t>
-      </w:r>
-      <w:r>
-        <w:rPr>
-          <w:rFonts w:ascii="Arial" w:cs="Arial" w:eastAsia="Arial" w:hAnsi="Arial"/>
-          <w:color w:val="555555"/>
-          <w:sz w:val="20"/>
-          <w:szCs w:val="20"/>
-        </w:rPr>
-        <w:t xml:space="preserve">   San Diego, CA</w:t>
-      </w:r>
-      <w:r>
-        <w:rPr>
-          <w:rFonts w:ascii="Arial" w:cs="Arial" w:eastAsia="Arial" w:hAnsi="Arial"/>
-          <w:color w:val="555555"/>
-          <w:sz w:val="20"/>
-          <w:szCs w:val="20"/>
-        </w:rPr>
-        <w:t xml:space="preserve">	Expected Jun 2026</w:t>
+        <w:t>UC San Diego — Rady School of Management   San Diego, CA</w:t>
+        <w:tab/>
+        <w:t>Expected Dec 2026</w:t>
       </w:r>
     </w:p>
     <w:p>

</xml_diff>

<commit_message>
Update certification from PADI Master Instructor to NAUI Instructor across website and CV
</commit_message>
<xml_diff>
--- a/AJ_AlJarallah_CV_Master.docx
+++ b/AJ_AlJarallah_CV_Master.docx
@@ -1138,34 +1138,20 @@
         <w:spacing w:after="60" w:before="20"/>
       </w:pPr>
       <w:r>
-        <w:rPr>
-          <w:rFonts w:ascii="Arial" w:cs="Arial" w:eastAsia="Arial" w:hAnsi="Arial"/>
-          <w:i/>
-          <w:iCs/>
-          <w:color w:val="111111"/>
-          <w:sz w:val="21"/>
-          <w:szCs w:val="21"/>
-        </w:rPr>
-        <w:t xml:space="preserve">Co-Founder &amp; PADI Master Instructor</w:t>
-      </w:r>
-    </w:p>
-    <w:p>
-      <w:pPr>
-        <w:pStyle w:val="ListParagraph"/>
-        <w:numPr>
-          <w:ilvl w:val="0"/>
-          <w:numId w:val="2"/>
-        </w:numPr>
-        <w:spacing w:after="60" w:before="0" w:line="280"/>
-      </w:pPr>
-      <w:r>
-        <w:rPr>
-          <w:rFonts w:ascii="Arial" w:cs="Arial" w:eastAsia="Arial" w:hAnsi="Arial"/>
-          <w:color w:val="111111"/>
-          <w:sz w:val="21"/>
-          <w:szCs w:val="21"/>
-        </w:rPr>
-        <w:t xml:space="preserve">PADI-certified diving center. 10+ years of instruction, business operations, and marketing.</w:t>
+        <w:t>Co-Founder &amp; NAUI Instructor</w:t>
+      </w:r>
+    </w:p>
+    <w:p>
+      <w:pPr>
+        <w:pStyle w:val="ListParagraph"/>
+        <w:numPr>
+          <w:ilvl w:val="0"/>
+          <w:numId w:val="2"/>
+        </w:numPr>
+        <w:spacing w:after="60" w:before="0" w:line="280"/>
+      </w:pPr>
+      <w:r>
+        <w:t>NAUI-certified diving center. 10+ years of instruction, business operations, and marketing.</w:t>
       </w:r>
     </w:p>
     <w:p>
@@ -1669,24 +1655,7 @@
         <w:spacing w:after="60" w:line="280"/>
       </w:pPr>
       <w:r>
-        <w:rPr>
-          <w:rFonts w:ascii="Arial" w:cs="Arial" w:eastAsia="Arial" w:hAnsi="Arial"/>
-          <w:b/>
-          <w:bCs/>
-          <w:color w:val="111111"/>
-          <w:sz w:val="21"/>
-          <w:szCs w:val="21"/>
-        </w:rPr>
-        <w:t xml:space="preserve">Other: </w:t>
-      </w:r>
-      <w:r>
-        <w:rPr>
-          <w:rFonts w:ascii="Arial" w:cs="Arial" w:eastAsia="Arial" w:hAnsi="Arial"/>
-          <w:color w:val="111111"/>
-          <w:sz w:val="21"/>
-          <w:szCs w:val="21"/>
-        </w:rPr>
-        <w:t xml:space="preserve">PADI Master Instructor.</w:t>
+        <w:t>Other: NAUI Instructor.</w:t>
       </w:r>
     </w:p>
     <w:sectPr>

</xml_diff>